<commit_message>
add electric contract, remove search bar
</commit_message>
<xml_diff>
--- a/src/frontend/public/templates/contract/VehicleContract.docx
+++ b/src/frontend/public/templates/contract/VehicleContract.docx
@@ -72,10 +72,26 @@
         <w:t>Today, on</w:t>
       </w:r>
       <w:r>
-        <w:t xml:space="preserve"> {createAt}</w:t>
-      </w:r>
-      <w:r>
-        <w:t>, through the Voltera system, we, the undersigned, include:</w:t>
+        <w:t xml:space="preserve"> {</w:t>
+      </w:r>
+      <w:proofErr w:type="spellStart"/>
+      <w:r>
+        <w:t>signedDate</w:t>
+      </w:r>
+      <w:proofErr w:type="spellEnd"/>
+      <w:r>
+        <w:t>}</w:t>
+      </w:r>
+      <w:r>
+        <w:t xml:space="preserve">, through the </w:t>
+      </w:r>
+      <w:proofErr w:type="spellStart"/>
+      <w:r>
+        <w:t>Voltera</w:t>
+      </w:r>
+      <w:proofErr w:type="spellEnd"/>
+      <w:r>
+        <w:t xml:space="preserve"> system, we, the undersigned, include:</w:t>
       </w:r>
     </w:p>
     <w:p>
@@ -208,7 +224,13 @@
     <w:p/>
     <w:p>
       <w:r>
-        <w:t>Both parties hereby agree to enter into this Electric Vehicle Sales Contract under the following terms and conditions:</w:t>
+        <w:t>Both parties here</w:t>
+      </w:r>
+      <w:r>
+        <w:t xml:space="preserve"> </w:t>
+      </w:r>
+      <w:r>
+        <w:t>by agree to enter into this Electric Vehicle Sales Contract under the following terms and conditions:</w:t>
       </w:r>
     </w:p>
     <w:p/>
@@ -252,7 +274,18 @@
         <w:t xml:space="preserve">Battery capacity: </w:t>
       </w:r>
       <w:r>
-        <w:t>{batteryCapacity}</w:t>
+        <w:t>{</w:t>
+      </w:r>
+      <w:proofErr w:type="spellStart"/>
+      <w:r>
+        <w:t>batteryCapacity</w:t>
+      </w:r>
+      <w:proofErr w:type="spellEnd"/>
+      <w:r>
+        <w:t>}</w:t>
+      </w:r>
+      <w:r>
+        <w:t xml:space="preserve"> kWh</w:t>
       </w:r>
     </w:p>
     <w:p>
@@ -326,6 +359,7 @@
           <w:numId w:val="4"/>
         </w:numPr>
       </w:pPr>
+      <w:bookmarkStart w:id="0" w:name="_Hlk213183252"/>
       <w:r>
         <w:t>The Seller guarantees that the electric vehicle is legally owned, free of disputes, pledges, or mortgages.</w:t>
       </w:r>
@@ -356,6 +390,7 @@
         <w:t>The Seller shall deliver the vehicle on time and in accordance with the description in the post.</w:t>
       </w:r>
     </w:p>
+    <w:bookmarkEnd w:id="0"/>
     <w:p>
       <w:pPr>
         <w:ind w:left="720"/>
@@ -401,6 +436,7 @@
           <w:numId w:val="5"/>
         </w:numPr>
       </w:pPr>
+      <w:bookmarkStart w:id="1" w:name="_Hlk213183268"/>
       <w:r>
         <w:t>The Buyer shall make full and timely payment as agreed.</w:t>
       </w:r>
@@ -432,6 +468,7 @@
         <w:t>The Buyer assumes full responsibility for the vehicle after the transaction is completed.</w:t>
       </w:r>
     </w:p>
+    <w:bookmarkEnd w:id="1"/>
     <w:p>
       <w:pPr>
         <w:ind w:left="720"/>
@@ -477,6 +514,7 @@
           <w:numId w:val="6"/>
         </w:numPr>
       </w:pPr>
+      <w:bookmarkStart w:id="2" w:name="_Hlk213183282"/>
       <w:r>
         <w:t>Both parties commit to fully complying with the terms of this contract.</w:t>
       </w:r>
@@ -503,6 +541,7 @@
         <w:t>In case of disputes, both parties shall first attempt to resolve them through negotiation; if unsuccessful, the matter shall be referred to the competent authorities for settlement.</w:t>
       </w:r>
     </w:p>
+    <w:bookmarkEnd w:id="2"/>
     <w:p>
       <w:pPr>
         <w:rPr>

</xml_diff>